<commit_message>
fixing creacion desde 0
</commit_message>
<xml_diff>
--- a/template/informeCompetencias.docx
+++ b/template/informeCompetencias.docx
@@ -364,12 +364,12 @@
             <wp:extent cx="5943600" cy="76200"/>
             <wp:effectExtent b="0" l="0" r="0" t="0"/>
             <wp:wrapSquare wrapText="bothSides" distB="114300" distT="114300" distL="114300" distR="114300"/>
-            <wp:docPr id="25" name="image12.png"/>
+            <wp:docPr id="23" name="image1.png"/>
             <a:graphic>
               <a:graphicData uri="http://schemas.openxmlformats.org/drawingml/2006/picture">
                 <pic:pic>
                   <pic:nvPicPr>
-                    <pic:cNvPr id="0" name="image12.png"/>
+                    <pic:cNvPr id="0" name="image1.png"/>
                     <pic:cNvPicPr preferRelativeResize="0"/>
                   </pic:nvPicPr>
                   <pic:blipFill>
@@ -435,12 +435,12 @@
           <wp:inline distB="114300" distT="114300" distL="114300" distR="114300">
             <wp:extent cx="5943600" cy="1498600"/>
             <wp:effectExtent b="0" l="0" r="0" t="0"/>
-            <wp:docPr id="16" name="image10.png"/>
+            <wp:docPr id="14" name="image18.png"/>
             <a:graphic>
               <a:graphicData uri="http://schemas.openxmlformats.org/drawingml/2006/picture">
                 <pic:pic>
                   <pic:nvPicPr>
-                    <pic:cNvPr id="0" name="image10.png"/>
+                    <pic:cNvPr id="0" name="image18.png"/>
                     <pic:cNvPicPr preferRelativeResize="0"/>
                   </pic:nvPicPr>
                   <pic:blipFill>
@@ -648,12 +648,12 @@
           <wp:inline distB="114300" distT="114300" distL="114300" distR="114300">
             <wp:extent cx="5943600" cy="368300"/>
             <wp:effectExtent b="0" l="0" r="0" t="0"/>
-            <wp:docPr id="2" name="image4.png"/>
+            <wp:docPr id="2" name="image3.png"/>
             <a:graphic>
               <a:graphicData uri="http://schemas.openxmlformats.org/drawingml/2006/picture">
                 <pic:pic>
                   <pic:nvPicPr>
-                    <pic:cNvPr id="0" name="image4.png"/>
+                    <pic:cNvPr id="0" name="image3.png"/>
                     <pic:cNvPicPr preferRelativeResize="0"/>
                   </pic:nvPicPr>
                   <pic:blipFill>
@@ -788,12 +788,12 @@
           <wp:inline distB="114300" distT="114300" distL="114300" distR="114300">
             <wp:extent cx="5943600" cy="1117600"/>
             <wp:effectExtent b="0" l="0" r="0" t="0"/>
-            <wp:docPr id="13" name="image15.png"/>
+            <wp:docPr id="12" name="image12.png"/>
             <a:graphic>
               <a:graphicData uri="http://schemas.openxmlformats.org/drawingml/2006/picture">
                 <pic:pic>
                   <pic:nvPicPr>
-                    <pic:cNvPr id="0" name="image15.png"/>
+                    <pic:cNvPr id="0" name="image12.png"/>
                     <pic:cNvPicPr preferRelativeResize="0"/>
                   </pic:nvPicPr>
                   <pic:blipFill>
@@ -875,12 +875,12 @@
           <wp:inline distB="114300" distT="114300" distL="114300" distR="114300">
             <wp:extent cx="5943600" cy="1104900"/>
             <wp:effectExtent b="0" l="0" r="0" t="0"/>
-            <wp:docPr id="12" name="image26.png"/>
+            <wp:docPr id="11" name="image22.png"/>
             <a:graphic>
               <a:graphicData uri="http://schemas.openxmlformats.org/drawingml/2006/picture">
                 <pic:pic>
                   <pic:nvPicPr>
-                    <pic:cNvPr id="0" name="image26.png"/>
+                    <pic:cNvPr id="0" name="image22.png"/>
                     <pic:cNvPicPr preferRelativeResize="0"/>
                   </pic:nvPicPr>
                   <pic:blipFill>
@@ -1137,7 +1137,7 @@
           <w:color w:val="0b2c3d"/>
           <w:rtl w:val="0"/>
         </w:rPr>
-        <w:t xml:space="preserve">Movilidad: (A ELECCIÓN DEL CLIENTE)</w:t>
+        <w:t xml:space="preserve">Movilidad</w:t>
       </w:r>
     </w:p>
     <w:p>
@@ -1305,12 +1305,12 @@
           <wp:inline distB="114300" distT="114300" distL="114300" distR="114300">
             <wp:extent cx="5943600" cy="76200"/>
             <wp:effectExtent b="0" l="0" r="0" t="0"/>
-            <wp:docPr id="22" name="image12.png"/>
+            <wp:docPr id="20" name="image1.png"/>
             <a:graphic>
               <a:graphicData uri="http://schemas.openxmlformats.org/drawingml/2006/picture">
                 <pic:pic>
                   <pic:nvPicPr>
-                    <pic:cNvPr id="0" name="image12.png"/>
+                    <pic:cNvPr id="0" name="image1.png"/>
                     <pic:cNvPicPr preferRelativeResize="0"/>
                   </pic:nvPicPr>
                   <pic:blipFill>
@@ -1403,12 +1403,12 @@
             <wp:extent cx="5581650" cy="152400"/>
             <wp:effectExtent b="0" l="0" r="0" t="0"/>
             <wp:wrapNone/>
-            <wp:docPr id="27" name="image14.png"/>
+            <wp:docPr id="25" name="image5.png"/>
             <a:graphic>
               <a:graphicData uri="http://schemas.openxmlformats.org/drawingml/2006/picture">
                 <pic:pic>
                   <pic:nvPicPr>
-                    <pic:cNvPr id="0" name="image14.png"/>
+                    <pic:cNvPr id="0" name="image5.png"/>
                     <pic:cNvPicPr preferRelativeResize="0"/>
                   </pic:nvPicPr>
                   <pic:blipFill>
@@ -1703,12 +1703,12 @@
           <wp:inline distB="114300" distT="114300" distL="114300" distR="114300">
             <wp:extent cx="5581650" cy="152400"/>
             <wp:effectExtent b="0" l="0" r="0" t="0"/>
-            <wp:docPr id="29" name="image14.png"/>
+            <wp:docPr id="27" name="image5.png"/>
             <a:graphic>
               <a:graphicData uri="http://schemas.openxmlformats.org/drawingml/2006/picture">
                 <pic:pic>
                   <pic:nvPicPr>
-                    <pic:cNvPr id="0" name="image14.png"/>
+                    <pic:cNvPr id="0" name="image5.png"/>
                     <pic:cNvPicPr preferRelativeResize="0"/>
                   </pic:nvPicPr>
                   <pic:blipFill>
@@ -1806,12 +1806,12 @@
             <wp:extent cx="5943600" cy="508000"/>
             <wp:effectExtent b="0" l="0" r="0" t="0"/>
             <wp:wrapSquare wrapText="bothSides" distB="114300" distT="114300" distL="114300" distR="114300"/>
-            <wp:docPr id="10" name="image3.png"/>
+            <wp:docPr id="9" name="image6.png"/>
             <a:graphic>
               <a:graphicData uri="http://schemas.openxmlformats.org/drawingml/2006/picture">
                 <pic:pic>
                   <pic:nvPicPr>
-                    <pic:cNvPr id="0" name="image3.png"/>
+                    <pic:cNvPr id="0" name="image6.png"/>
                     <pic:cNvPicPr preferRelativeResize="0"/>
                   </pic:nvPicPr>
                   <pic:blipFill>
@@ -1983,12 +1983,12 @@
             <wp:extent cx="5943600" cy="508000"/>
             <wp:effectExtent b="0" l="0" r="0" t="0"/>
             <wp:wrapSquare wrapText="bothSides" distB="114300" distT="114300" distL="114300" distR="114300"/>
-            <wp:docPr id="3" name="image9.png"/>
+            <wp:docPr id="3" name="image11.png"/>
             <a:graphic>
               <a:graphicData uri="http://schemas.openxmlformats.org/drawingml/2006/picture">
                 <pic:pic>
                   <pic:nvPicPr>
-                    <pic:cNvPr id="0" name="image9.png"/>
+                    <pic:cNvPr id="0" name="image11.png"/>
                     <pic:cNvPicPr preferRelativeResize="0"/>
                   </pic:nvPicPr>
                   <pic:blipFill>
@@ -2071,12 +2071,12 @@
             <wp:extent cx="5943600" cy="508000"/>
             <wp:effectExtent b="0" l="0" r="0" t="0"/>
             <wp:wrapSquare wrapText="bothSides" distB="114300" distT="114300" distL="114300" distR="114300"/>
-            <wp:docPr id="5" name="image1.png"/>
+            <wp:docPr id="5" name="image16.png"/>
             <a:graphic>
               <a:graphicData uri="http://schemas.openxmlformats.org/drawingml/2006/picture">
                 <pic:pic>
                   <pic:nvPicPr>
-                    <pic:cNvPr id="0" name="image1.png"/>
+                    <pic:cNvPr id="0" name="image16.png"/>
                     <pic:cNvPicPr preferRelativeResize="0"/>
                   </pic:nvPicPr>
                   <pic:blipFill>
@@ -2291,12 +2291,12 @@
           <wp:inline distB="114300" distT="114300" distL="114300" distR="114300">
             <wp:extent cx="5581650" cy="152400"/>
             <wp:effectExtent b="0" l="0" r="0" t="0"/>
-            <wp:docPr id="19" name="image14.png"/>
+            <wp:docPr id="17" name="image5.png"/>
             <a:graphic>
               <a:graphicData uri="http://schemas.openxmlformats.org/drawingml/2006/picture">
                 <pic:pic>
                   <pic:nvPicPr>
-                    <pic:cNvPr id="0" name="image14.png"/>
+                    <pic:cNvPr id="0" name="image5.png"/>
                     <pic:cNvPicPr preferRelativeResize="0"/>
                   </pic:nvPicPr>
                   <pic:blipFill>
@@ -2397,12 +2397,12 @@
           <wp:inline distB="114300" distT="114300" distL="114300" distR="114300">
             <wp:extent cx="5943600" cy="647700"/>
             <wp:effectExtent b="0" l="0" r="0" t="0"/>
-            <wp:docPr id="21" name="image21.png"/>
+            <wp:docPr id="19" name="image9.png"/>
             <a:graphic>
               <a:graphicData uri="http://schemas.openxmlformats.org/drawingml/2006/picture">
                 <pic:pic>
                   <pic:nvPicPr>
-                    <pic:cNvPr id="0" name="image21.png"/>
+                    <pic:cNvPr id="0" name="image9.png"/>
                     <pic:cNvPicPr preferRelativeResize="0"/>
                   </pic:nvPicPr>
                   <pic:blipFill>
@@ -2710,12 +2710,12 @@
           <wp:inline distB="114300" distT="114300" distL="114300" distR="114300">
             <wp:extent cx="5943600" cy="292100"/>
             <wp:effectExtent b="0" l="0" r="0" t="0"/>
-            <wp:docPr id="26" name="image19.png"/>
+            <wp:docPr id="24" name="image17.png"/>
             <a:graphic>
               <a:graphicData uri="http://schemas.openxmlformats.org/drawingml/2006/picture">
                 <pic:pic>
                   <pic:nvPicPr>
-                    <pic:cNvPr id="0" name="image19.png"/>
+                    <pic:cNvPr id="0" name="image17.png"/>
                     <pic:cNvPicPr preferRelativeResize="0"/>
                   </pic:nvPicPr>
                   <pic:blipFill>
@@ -2892,12 +2892,12 @@
           <wp:inline distB="114300" distT="114300" distL="114300" distR="114300">
             <wp:extent cx="5943600" cy="292100"/>
             <wp:effectExtent b="0" l="0" r="0" t="0"/>
-            <wp:docPr id="1" name="image6.png"/>
+            <wp:docPr id="1" name="image15.png"/>
             <a:graphic>
               <a:graphicData uri="http://schemas.openxmlformats.org/drawingml/2006/picture">
                 <pic:pic>
                   <pic:nvPicPr>
-                    <pic:cNvPr id="0" name="image6.png"/>
+                    <pic:cNvPr id="0" name="image15.png"/>
                     <pic:cNvPicPr preferRelativeResize="0"/>
                   </pic:nvPicPr>
                   <pic:blipFill>
@@ -3115,12 +3115,12 @@
             <wp:extent cx="642938" cy="642938"/>
             <wp:effectExtent b="0" l="0" r="0" t="0"/>
             <wp:wrapSquare wrapText="bothSides" distB="114300" distT="114300" distL="114300" distR="114300"/>
-            <wp:docPr id="24" name="image20.png"/>
+            <wp:docPr id="22" name="image10.png"/>
             <a:graphic>
               <a:graphicData uri="http://schemas.openxmlformats.org/drawingml/2006/picture">
                 <pic:pic>
                   <pic:nvPicPr>
-                    <pic:cNvPr id="0" name="image20.png"/>
+                    <pic:cNvPr id="0" name="image10.png"/>
                     <pic:cNvPicPr preferRelativeResize="0"/>
                   </pic:nvPicPr>
                   <pic:blipFill>
@@ -3182,7 +3182,7 @@
           <w:szCs w:val="36"/>
           <w:rtl w:val="0"/>
         </w:rPr>
-        <w:t xml:space="preserve">Evaluación 2022 y 2024</w:t>
+        <w:t xml:space="preserve">Evaluación {{lastYear}} - {{currentYear}}</w:t>
       </w:r>
     </w:p>
     <w:p>
@@ -3232,84 +3232,9 @@
           <w:color w:val="e5554f"/>
           <w:sz w:val="36"/>
           <w:szCs w:val="36"/>
-        </w:rPr>
-        <w:drawing>
-          <wp:inline distB="114300" distT="114300" distL="114300" distR="114300">
-            <wp:extent cx="4900613" cy="2689810"/>
-            <wp:effectExtent b="0" l="0" r="0" t="0"/>
-            <wp:docPr id="14" name="image7.png"/>
-            <a:graphic>
-              <a:graphicData uri="http://schemas.openxmlformats.org/drawingml/2006/picture">
-                <pic:pic>
-                  <pic:nvPicPr>
-                    <pic:cNvPr id="0" name="image7.png"/>
-                    <pic:cNvPicPr preferRelativeResize="0"/>
-                  </pic:nvPicPr>
-                  <pic:blipFill>
-                    <a:blip r:embed="rId19"/>
-                    <a:srcRect b="3798" l="0" r="11378" t="9491"/>
-                    <a:stretch>
-                      <a:fillRect/>
-                    </a:stretch>
-                  </pic:blipFill>
-                  <pic:spPr>
-                    <a:xfrm>
-                      <a:off x="0" y="0"/>
-                      <a:ext cx="4900613" cy="2689810"/>
-                    </a:xfrm>
-                    <a:prstGeom prst="rect"/>
-                    <a:ln/>
-                  </pic:spPr>
-                </pic:pic>
-              </a:graphicData>
-            </a:graphic>
-          </wp:inline>
-        </w:drawing>
-      </w:r>
-      <w:r>
-        <w:rPr>
-          <w:rtl w:val="0"/>
-        </w:rPr>
-      </w:r>
-    </w:p>
-    <w:p>
-      <w:pPr>
-        <w:pStyle w:val="Heading2"/>
-        <w:ind w:left="1440" w:firstLine="0"/>
-        <w:rPr>
-          <w:rFonts w:ascii="Open Sans ExtraBold" w:cs="Open Sans ExtraBold" w:eastAsia="Open Sans ExtraBold" w:hAnsi="Open Sans ExtraBold"/>
-          <w:color w:val="0b2c3d"/>
-          <w:sz w:val="44"/>
-          <w:szCs w:val="44"/>
-        </w:rPr>
-      </w:pPr>
-      <w:bookmarkStart w:colFirst="0" w:colLast="0" w:name="_556ndd4g83b" w:id="13"/>
-      <w:bookmarkEnd w:id="13"/>
-      <w:r>
-        <w:rPr>
-          <w:rFonts w:ascii="Open Sans" w:cs="Open Sans" w:eastAsia="Open Sans" w:hAnsi="Open Sans"/>
-          <w:b w:val="1"/>
-          <w:color w:val="0b2c3d"/>
-          <w:sz w:val="36"/>
-          <w:szCs w:val="36"/>
-          <w:rtl w:val="0"/>
-        </w:rPr>
-        <w:t xml:space="preserve">Gráfico de competencias comparativo con Población DH</w:t>
-      </w:r>
-      <w:r>
-        <w:rPr>
-          <w:rtl w:val="0"/>
-        </w:rPr>
-      </w:r>
-    </w:p>
-    <w:p>
-      <w:pPr>
-        <w:rPr/>
-      </w:pPr>
-      <w:r>
-        <w:pict>
-          <v:rect style="width:0.0pt;height:1.5pt" o:hr="t" o:hrstd="t" o:hralign="center" fillcolor="#A0A0A0" stroked="f"/>
-        </w:pict>
+          <w:rtl w:val="0"/>
+        </w:rPr>
+        <w:t xml:space="preserve">{{radar}}</w:t>
       </w:r>
       <w:r>
         <w:rPr>
@@ -3328,48 +3253,8 @@
           <w:szCs w:val="22"/>
         </w:rPr>
       </w:pPr>
-      <w:bookmarkStart w:colFirst="0" w:colLast="0" w:name="_ln49ncwvmz2p" w:id="14"/>
-      <w:bookmarkEnd w:id="14"/>
-      <w:r>
-        <w:rPr>
-          <w:rFonts w:ascii="Open Sans" w:cs="Open Sans" w:eastAsia="Open Sans" w:hAnsi="Open Sans"/>
-          <w:color w:val="695d46"/>
-          <w:sz w:val="22"/>
-          <w:szCs w:val="22"/>
-        </w:rPr>
-        <w:drawing>
-          <wp:inline distB="114300" distT="114300" distL="114300" distR="114300">
-            <wp:extent cx="4414568" cy="2506662"/>
-            <wp:effectExtent b="0" l="0" r="0" t="0"/>
-            <wp:docPr id="8" name="image2.png"/>
-            <a:graphic>
-              <a:graphicData uri="http://schemas.openxmlformats.org/drawingml/2006/picture">
-                <pic:pic>
-                  <pic:nvPicPr>
-                    <pic:cNvPr id="0" name="image2.png"/>
-                    <pic:cNvPicPr preferRelativeResize="0"/>
-                  </pic:nvPicPr>
-                  <pic:blipFill>
-                    <a:blip r:embed="rId20"/>
-                    <a:srcRect b="5337" l="0" r="12179" t="5766"/>
-                    <a:stretch>
-                      <a:fillRect/>
-                    </a:stretch>
-                  </pic:blipFill>
-                  <pic:spPr>
-                    <a:xfrm>
-                      <a:off x="0" y="0"/>
-                      <a:ext cx="4414568" cy="2506662"/>
-                    </a:xfrm>
-                    <a:prstGeom prst="rect"/>
-                    <a:ln/>
-                  </pic:spPr>
-                </pic:pic>
-              </a:graphicData>
-            </a:graphic>
-          </wp:inline>
-        </w:drawing>
-      </w:r>
+      <w:bookmarkStart w:colFirst="0" w:colLast="0" w:name="_ln49ncwvmz2p" w:id="13"/>
+      <w:bookmarkEnd w:id="13"/>
       <w:r>
         <w:br w:type="page"/>
       </w:r>
@@ -3390,20 +3275,20 @@
           <w:szCs w:val="82"/>
         </w:rPr>
       </w:pPr>
-      <w:bookmarkStart w:colFirst="0" w:colLast="0" w:name="_xkdydcikv61i" w:id="15"/>
-      <w:bookmarkEnd w:id="15"/>
+      <w:bookmarkStart w:colFirst="0" w:colLast="0" w:name="_xkdydcikv61i" w:id="14"/>
+      <w:bookmarkEnd w:id="14"/>
       <w:r>
         <w:rPr/>
         <w:drawing>
           <wp:inline distB="114300" distT="114300" distL="114300" distR="114300">
             <wp:extent cx="5581650" cy="152400"/>
             <wp:effectExtent b="0" l="0" r="0" t="0"/>
-            <wp:docPr id="28" name="image14.png"/>
+            <wp:docPr id="26" name="image5.png"/>
             <a:graphic>
               <a:graphicData uri="http://schemas.openxmlformats.org/drawingml/2006/picture">
                 <pic:pic>
                   <pic:nvPicPr>
-                    <pic:cNvPr id="0" name="image14.png"/>
+                    <pic:cNvPr id="0" name="image5.png"/>
                     <pic:cNvPicPr preferRelativeResize="0"/>
                   </pic:nvPicPr>
                   <pic:blipFill>
@@ -3465,8 +3350,8 @@
           <w:color w:val="e5554f"/>
         </w:rPr>
       </w:pPr>
-      <w:bookmarkStart w:colFirst="0" w:colLast="0" w:name="_tc1w4p8euq7t" w:id="16"/>
-      <w:bookmarkEnd w:id="16"/>
+      <w:bookmarkStart w:colFirst="0" w:colLast="0" w:name="_tc1w4p8euq7t" w:id="15"/>
+      <w:bookmarkEnd w:id="15"/>
       <w:r>
         <w:rPr>
           <w:rFonts w:ascii="Open Sans" w:cs="Open Sans" w:eastAsia="Open Sans" w:hAnsi="Open Sans"/>
@@ -3513,16 +3398,16 @@
             <wp:extent cx="566738" cy="566738"/>
             <wp:effectExtent b="0" l="0" r="0" t="0"/>
             <wp:wrapSquare wrapText="bothSides" distB="114300" distT="114300" distL="114300" distR="114300"/>
-            <wp:docPr id="9" name="image5.png"/>
+            <wp:docPr id="8" name="image14.png"/>
             <a:graphic>
               <a:graphicData uri="http://schemas.openxmlformats.org/drawingml/2006/picture">
                 <pic:pic>
                   <pic:nvPicPr>
-                    <pic:cNvPr id="0" name="image5.png"/>
+                    <pic:cNvPr id="0" name="image14.png"/>
                     <pic:cNvPicPr preferRelativeResize="0"/>
                   </pic:nvPicPr>
                   <pic:blipFill>
-                    <a:blip r:embed="rId21"/>
+                    <a:blip r:embed="rId19"/>
                     <a:srcRect b="0" l="0" r="0" t="0"/>
                     <a:stretch>
                       <a:fillRect/>
@@ -3677,8 +3562,8 @@
           <w:color w:val="192c55"/>
         </w:rPr>
       </w:pPr>
-      <w:bookmarkStart w:colFirst="0" w:colLast="0" w:name="_b15qp94wuvxh" w:id="17"/>
-      <w:bookmarkEnd w:id="17"/>
+      <w:bookmarkStart w:colFirst="0" w:colLast="0" w:name="_b15qp94wuvxh" w:id="16"/>
+      <w:bookmarkEnd w:id="16"/>
       <w:r>
         <w:rPr>
           <w:rtl w:val="0"/>
@@ -3697,16 +3582,16 @@
             <wp:extent cx="595313" cy="595313"/>
             <wp:effectExtent b="0" l="0" r="0" t="0"/>
             <wp:wrapSquare wrapText="bothSides" distB="114300" distT="114300" distL="114300" distR="114300"/>
-            <wp:docPr id="11" name="image11.png"/>
+            <wp:docPr id="10" name="image2.png"/>
             <a:graphic>
               <a:graphicData uri="http://schemas.openxmlformats.org/drawingml/2006/picture">
                 <pic:pic>
                   <pic:nvPicPr>
-                    <pic:cNvPr id="0" name="image11.png"/>
+                    <pic:cNvPr id="0" name="image2.png"/>
                     <pic:cNvPicPr preferRelativeResize="0"/>
                   </pic:nvPicPr>
                   <pic:blipFill>
-                    <a:blip r:embed="rId22"/>
+                    <a:blip r:embed="rId20"/>
                     <a:srcRect b="0" l="0" r="0" t="0"/>
                     <a:stretch>
                       <a:fillRect/>
@@ -3908,8 +3793,8 @@
         <w:jc w:val="left"/>
         <w:rPr/>
       </w:pPr>
-      <w:bookmarkStart w:colFirst="0" w:colLast="0" w:name="_kbo0etx0gcye" w:id="18"/>
-      <w:bookmarkEnd w:id="18"/>
+      <w:bookmarkStart w:colFirst="0" w:colLast="0" w:name="_kbo0etx0gcye" w:id="17"/>
+      <w:bookmarkEnd w:id="17"/>
       <w:r>
         <w:rPr>
           <w:rtl w:val="0"/>
@@ -3927,20 +3812,20 @@
           <w:szCs w:val="60"/>
         </w:rPr>
       </w:pPr>
-      <w:bookmarkStart w:colFirst="0" w:colLast="0" w:name="_tsl88jip0xgl" w:id="19"/>
-      <w:bookmarkEnd w:id="19"/>
+      <w:bookmarkStart w:colFirst="0" w:colLast="0" w:name="_tsl88jip0xgl" w:id="18"/>
+      <w:bookmarkEnd w:id="18"/>
       <w:r>
         <w:rPr/>
         <w:drawing>
           <wp:inline distB="114300" distT="114300" distL="114300" distR="114300">
             <wp:extent cx="5581650" cy="152400"/>
             <wp:effectExtent b="0" l="0" r="0" t="0"/>
-            <wp:docPr id="7" name="image14.png"/>
+            <wp:docPr id="7" name="image5.png"/>
             <a:graphic>
               <a:graphicData uri="http://schemas.openxmlformats.org/drawingml/2006/picture">
                 <pic:pic>
                   <pic:nvPicPr>
-                    <pic:cNvPr id="0" name="image14.png"/>
+                    <pic:cNvPr id="0" name="image5.png"/>
                     <pic:cNvPicPr preferRelativeResize="0"/>
                   </pic:nvPicPr>
                   <pic:blipFill>
@@ -3989,8 +3874,8 @@
           <w:color w:val="e5554f"/>
         </w:rPr>
       </w:pPr>
-      <w:bookmarkStart w:colFirst="0" w:colLast="0" w:name="_h7v7w84bgsbh" w:id="20"/>
-      <w:bookmarkEnd w:id="20"/>
+      <w:bookmarkStart w:colFirst="0" w:colLast="0" w:name="_h7v7w84bgsbh" w:id="19"/>
+      <w:bookmarkEnd w:id="19"/>
       <w:r>
         <w:rPr>
           <w:rFonts w:ascii="Open Sans" w:cs="Open Sans" w:eastAsia="Open Sans" w:hAnsi="Open Sans"/>
@@ -4052,16 +3937,16 @@
             <wp:extent cx="4710113" cy="248368"/>
             <wp:effectExtent b="0" l="0" r="0" t="0"/>
             <wp:wrapSquare wrapText="bothSides" distB="114300" distT="114300" distL="114300" distR="114300"/>
-            <wp:docPr id="20" name="image16.png"/>
+            <wp:docPr id="18" name="image20.png"/>
             <a:graphic>
               <a:graphicData uri="http://schemas.openxmlformats.org/drawingml/2006/picture">
                 <pic:pic>
                   <pic:nvPicPr>
-                    <pic:cNvPr id="0" name="image16.png"/>
+                    <pic:cNvPr id="0" name="image20.png"/>
                     <pic:cNvPicPr preferRelativeResize="0"/>
                   </pic:nvPicPr>
                   <pic:blipFill>
-                    <a:blip r:embed="rId23"/>
+                    <a:blip r:embed="rId21"/>
                     <a:srcRect b="0" l="0" r="0" t="0"/>
                     <a:stretch>
                       <a:fillRect/>
@@ -4122,8 +4007,8 @@
           <w:color w:val="192c55"/>
         </w:rPr>
       </w:pPr>
-      <w:bookmarkStart w:colFirst="0" w:colLast="0" w:name="_p212eco1g5wf" w:id="21"/>
-      <w:bookmarkEnd w:id="21"/>
+      <w:bookmarkStart w:colFirst="0" w:colLast="0" w:name="_p212eco1g5wf" w:id="20"/>
+      <w:bookmarkEnd w:id="20"/>
       <w:r>
         <w:rPr>
           <w:rFonts w:ascii="Open Sans" w:cs="Open Sans" w:eastAsia="Open Sans" w:hAnsi="Open Sans"/>
@@ -4146,16 +4031,16 @@
             <wp:extent cx="757238" cy="796228"/>
             <wp:effectExtent b="0" l="0" r="0" t="0"/>
             <wp:wrapSquare wrapText="bothSides" distB="114300" distT="114300" distL="114300" distR="114300"/>
-            <wp:docPr id="6" name="image8.png"/>
+            <wp:docPr id="6" name="image24.png"/>
             <a:graphic>
               <a:graphicData uri="http://schemas.openxmlformats.org/drawingml/2006/picture">
                 <pic:pic>
                   <pic:nvPicPr>
-                    <pic:cNvPr id="0" name="image8.png"/>
+                    <pic:cNvPr id="0" name="image24.png"/>
                     <pic:cNvPicPr preferRelativeResize="0"/>
                   </pic:nvPicPr>
                   <pic:blipFill>
-                    <a:blip r:embed="rId24"/>
+                    <a:blip r:embed="rId22"/>
                     <a:srcRect b="0" l="0" r="0" t="0"/>
                     <a:stretch>
                       <a:fillRect/>
@@ -4199,8 +4084,8 @@
         <w:jc w:val="both"/>
         <w:rPr/>
       </w:pPr>
-      <w:bookmarkStart w:colFirst="0" w:colLast="0" w:name="_wmlpfgwvdb8p" w:id="22"/>
-      <w:bookmarkEnd w:id="22"/>
+      <w:bookmarkStart w:colFirst="0" w:colLast="0" w:name="_wmlpfgwvdb8p" w:id="21"/>
+      <w:bookmarkEnd w:id="21"/>
       <w:r>
         <w:rPr>
           <w:rFonts w:ascii="Open Sans" w:cs="Open Sans" w:eastAsia="Open Sans" w:hAnsi="Open Sans"/>
@@ -4228,16 +4113,16 @@
             <wp:extent cx="663097" cy="665163"/>
             <wp:effectExtent b="0" l="0" r="0" t="0"/>
             <wp:wrapSquare wrapText="bothSides" distB="114300" distT="114300" distL="114300" distR="114300"/>
-            <wp:docPr id="31" name="image23.png"/>
+            <wp:docPr id="29" name="image21.png"/>
             <a:graphic>
               <a:graphicData uri="http://schemas.openxmlformats.org/drawingml/2006/picture">
                 <pic:pic>
                   <pic:nvPicPr>
-                    <pic:cNvPr id="0" name="image23.png"/>
+                    <pic:cNvPr id="0" name="image21.png"/>
                     <pic:cNvPicPr preferRelativeResize="0"/>
                   </pic:nvPicPr>
                   <pic:blipFill>
-                    <a:blip r:embed="rId25"/>
+                    <a:blip r:embed="rId23"/>
                     <a:srcRect b="0" l="0" r="0" t="0"/>
                     <a:stretch>
                       <a:fillRect/>
@@ -4421,8 +4306,8 @@
           <w:color w:val="e5554f"/>
         </w:rPr>
       </w:pPr>
-      <w:bookmarkStart w:colFirst="0" w:colLast="0" w:name="_1tjh7oyssph8" w:id="23"/>
-      <w:bookmarkEnd w:id="23"/>
+      <w:bookmarkStart w:colFirst="0" w:colLast="0" w:name="_1tjh7oyssph8" w:id="22"/>
+      <w:bookmarkEnd w:id="22"/>
       <w:r>
         <w:rPr>
           <w:color w:val="e5554f"/>
@@ -4431,16 +4316,16 @@
           <wp:inline distB="114300" distT="114300" distL="114300" distR="114300">
             <wp:extent cx="5943600" cy="1104900"/>
             <wp:effectExtent b="0" l="0" r="0" t="0"/>
-            <wp:docPr id="23" name="image22.png"/>
+            <wp:docPr id="21" name="image23.png"/>
             <a:graphic>
               <a:graphicData uri="http://schemas.openxmlformats.org/drawingml/2006/picture">
                 <pic:pic>
                   <pic:nvPicPr>
-                    <pic:cNvPr id="0" name="image22.png"/>
+                    <pic:cNvPr id="0" name="image23.png"/>
                     <pic:cNvPicPr preferRelativeResize="0"/>
                   </pic:nvPicPr>
                   <pic:blipFill>
-                    <a:blip r:embed="rId26"/>
+                    <a:blip r:embed="rId24"/>
                     <a:srcRect b="0" l="0" r="0" t="0"/>
                     <a:stretch>
                       <a:fillRect/>
@@ -4565,16 +4450,16 @@
             <wp:extent cx="638175" cy="602721"/>
             <wp:effectExtent b="0" l="0" r="0" t="0"/>
             <wp:wrapSquare wrapText="bothSides" distB="114300" distT="114300" distL="114300" distR="114300"/>
-            <wp:docPr id="17" name="image18.png"/>
+            <wp:docPr id="15" name="image13.png"/>
             <a:graphic>
               <a:graphicData uri="http://schemas.openxmlformats.org/drawingml/2006/picture">
                 <pic:pic>
                   <pic:nvPicPr>
-                    <pic:cNvPr id="0" name="image18.png"/>
+                    <pic:cNvPr id="0" name="image13.png"/>
                     <pic:cNvPicPr preferRelativeResize="0"/>
                   </pic:nvPicPr>
                   <pic:blipFill>
-                    <a:blip r:embed="rId27"/>
+                    <a:blip r:embed="rId25"/>
                     <a:srcRect b="0" l="0" r="0" t="0"/>
                     <a:stretch>
                       <a:fillRect/>
@@ -4641,16 +4526,16 @@
             <wp:extent cx="638175" cy="831307"/>
             <wp:effectExtent b="0" l="0" r="0" t="0"/>
             <wp:wrapSquare wrapText="bothSides" distB="114300" distT="114300" distL="114300" distR="114300"/>
-            <wp:docPr id="30" name="image25.png"/>
+            <wp:docPr id="28" name="image19.png"/>
             <a:graphic>
               <a:graphicData uri="http://schemas.openxmlformats.org/drawingml/2006/picture">
                 <pic:pic>
                   <pic:nvPicPr>
-                    <pic:cNvPr id="0" name="image25.png"/>
+                    <pic:cNvPr id="0" name="image19.png"/>
                     <pic:cNvPicPr preferRelativeResize="0"/>
                   </pic:nvPicPr>
                   <pic:blipFill>
-                    <a:blip r:embed="rId28"/>
+                    <a:blip r:embed="rId26"/>
                     <a:srcRect b="0" l="0" r="0" t="0"/>
                     <a:stretch>
                       <a:fillRect/>
@@ -4740,16 +4625,16 @@
             <wp:extent cx="638175" cy="807816"/>
             <wp:effectExtent b="0" l="0" r="0" t="0"/>
             <wp:wrapSquare wrapText="bothSides" distB="114300" distT="114300" distL="114300" distR="114300"/>
-            <wp:docPr id="4" name="image13.png"/>
+            <wp:docPr id="4" name="image7.png"/>
             <a:graphic>
               <a:graphicData uri="http://schemas.openxmlformats.org/drawingml/2006/picture">
                 <pic:pic>
                   <pic:nvPicPr>
-                    <pic:cNvPr id="0" name="image13.png"/>
+                    <pic:cNvPr id="0" name="image7.png"/>
                     <pic:cNvPicPr preferRelativeResize="0"/>
                   </pic:nvPicPr>
                   <pic:blipFill>
-                    <a:blip r:embed="rId29"/>
+                    <a:blip r:embed="rId27"/>
                     <a:srcRect b="0" l="0" r="0" t="0"/>
                     <a:stretch>
                       <a:fillRect/>
@@ -4889,12 +4774,12 @@
           <wp:inline distB="114300" distT="114300" distL="114300" distR="114300">
             <wp:extent cx="5943600" cy="1117600"/>
             <wp:effectExtent b="0" l="0" r="0" t="0"/>
-            <wp:docPr id="18" name="image17.png"/>
+            <wp:docPr id="16" name="image8.png"/>
             <a:graphic>
               <a:graphicData uri="http://schemas.openxmlformats.org/drawingml/2006/picture">
                 <pic:pic>
                   <pic:nvPicPr>
-                    <pic:cNvPr id="0" name="image17.png"/>
+                    <pic:cNvPr id="0" name="image8.png"/>
                     <pic:cNvPicPr preferRelativeResize="0"/>
                   </pic:nvPicPr>
                   <pic:blipFill>
@@ -4925,12 +4810,12 @@
       </w:r>
     </w:p>
     <w:sectPr>
-      <w:headerReference r:id="rId30" w:type="default"/>
-      <w:headerReference r:id="rId31" w:type="first"/>
-      <w:headerReference r:id="rId32" w:type="even"/>
-      <w:footerReference r:id="rId33" w:type="default"/>
-      <w:footerReference r:id="rId34" w:type="first"/>
-      <w:footerReference r:id="rId35" w:type="even"/>
+      <w:headerReference r:id="rId28" w:type="default"/>
+      <w:headerReference r:id="rId29" w:type="first"/>
+      <w:headerReference r:id="rId30" w:type="even"/>
+      <w:footerReference r:id="rId31" w:type="default"/>
+      <w:footerReference r:id="rId32" w:type="first"/>
+      <w:footerReference r:id="rId33" w:type="even"/>
       <w:pgSz w:h="15840" w:w="12240" w:orient="portrait"/>
       <w:pgMar w:bottom="1080" w:top="1080" w:left="1440" w:right="1440" w:header="0" w:footer="720"/>
       <w:pgNumType w:start="2"/>
@@ -5028,8 +4913,8 @@
       <w:ind w:left="-1417.3228346456694" w:right="-1440" w:firstLine="0"/>
       <w:rPr/>
     </w:pPr>
-    <w:bookmarkStart w:colFirst="0" w:colLast="0" w:name="_z1s5729ybphg" w:id="24"/>
-    <w:bookmarkEnd w:id="24"/>
+    <w:bookmarkStart w:colFirst="0" w:colLast="0" w:name="_z1s5729ybphg" w:id="23"/>
+    <w:bookmarkEnd w:id="23"/>
     <w:r>
       <w:rPr>
         <w:rtl w:val="0"/>
@@ -5048,12 +4933,12 @@
           <wp:extent cx="7733787" cy="2763837"/>
           <wp:effectExtent b="0" l="0" r="0" t="0"/>
           <wp:wrapSquare wrapText="bothSides" distB="114300" distT="114300" distL="114300" distR="114300"/>
-          <wp:docPr id="15" name="image24.png"/>
+          <wp:docPr id="13" name="image4.png"/>
           <a:graphic>
             <a:graphicData uri="http://schemas.openxmlformats.org/drawingml/2006/picture">
               <pic:pic>
                 <pic:nvPicPr>
-                  <pic:cNvPr id="0" name="image24.png"/>
+                  <pic:cNvPr id="0" name="image4.png"/>
                   <pic:cNvPicPr preferRelativeResize="0"/>
                 </pic:nvPicPr>
                 <pic:blipFill>

</xml_diff>